<commit_message>
Regenerate deliverables from corrected sources; add poster to package
The DOCX package was generated before several corrections landed and still
carried the retracted ~4,000-4,800 ha / ~10,000 acre seagrass figure. All 14
documents regenerated from current markdown, now reflecting:
- seagrass restoration = 3,612 ha (~8,900 acres), Orth et al. 2020
- pathway_2 groundwater citation corrected to Accomack County Regional Water
  Supply Plan (2010), scoped to Accomack

Also adds the poster HTML and content spec to the deliverables package.
</commit_message>
<xml_diff>
--- a/deliverables/ECOLOGICAL_EFFECTS_SYNTHESIS.docx
+++ b/deliverables/ECOLOGICAL_EFFECTS_SYNTHESIS.docx
@@ -675,7 +675,7 @@
         <w:t xml:space="preserve">the largest successful seagrass restoration in the world</w:t>
       </w:r>
       <w:r>
-        <w:t xml:space="preserve">: roughly 4,000–4,800 hectares (~10,000 acres) of</w:t>
+        <w:t xml:space="preserve">: 3,612 hectares (~8,900 acres) of</w:t>
       </w:r>
       <w:r>
         <w:t xml:space="preserve"> </w:t>
@@ -691,7 +691,7 @@
         <w:t xml:space="preserve"> </w:t>
       </w:r>
       <w:r>
-        <w:t xml:space="preserve">eelgrass restored across South, Cobb, Spider Crab, and Hog Island Bays, expanding at approximately 240 hectares per year since 2007 (Orth, Lefcheck, McGlathery et al. 2020; Aoki, McGlathery, and Orth 2020). The restoration has re-established the physical structure, the clear-water state, the carbon-sequestration function, and the faunal community of a coastal ecosystem that had been lost for 75 years.</w:t>
+        <w:t xml:space="preserve">eelgrass restored across South, Cobb, Spider Crab, and Hog Island Bays from more than 70 million seeds broadcast since 1999, expanding at approximately 240 hectares per year since 2007 (Orth, Lefcheck, McGlathery et al. 2020; Aoki, McGlathery, and Orth 2020). The restoration has re-established the physical structure, the clear-water state, the carbon-sequestration function, and the faunal community of a coastal ecosystem that had been lost for 75 years.</w:t>
       </w:r>
     </w:p>
     <w:p>

</xml_diff>